<commit_message>
Nuno job-hunt pack v2 + mirror-agent training cycle (2026-05-25)
- Excel role tracker expanded 32->110 employers across 10 profile buckets (ops, sales, hotel, qc, hotel-fb, tourism, training, hotel-fo, qc-supplier, sales-account); 12->37 job-board searches incl. 30-day freshness filters.

- Builder script (nuno-build-roles-xlsx.ps1) now derives Dashboard categories from seed data instead of hardcoding hotel/qc/sales.

- Added nuno-roles-merge-expand.ps1 with JSON-array-salvage pattern for truncated heavy-reasoning-model responses.

- 4 corrective lessons prepended to LESSONS.md (applies=both): truncated-JSON salvage, stage-then-zip via .NET, probe Office locks first, data-driven Excel dashboard.

- SESSION_LOG.md recreated (prior 3442-line history was wiped by user before this checkpoint).

- Day airouter spend: 21 calls / ~190k tokens via clone-agent->CHost worker (Qwen3.6).
</commit_message>
<xml_diff>
--- a/MCounterPart-Architecture.docx
+++ b/MCounterPart-Architecture.docx
@@ -5,42 +5,95 @@
     <w:p>
       <w:pPr>
         <w:pStyle w:val="Title"/>
-      </w:pPr>
-      <w:r>
+        <w:rPr>
+          <w:lang w:val="en-US"/>
+        </w:rPr>
+      </w:pPr>
+      <w:r>
+        <w:rPr>
+          <w:lang w:val="en-US"/>
+        </w:rPr>
         <w:t>MCounterPart</w:t>
       </w:r>
     </w:p>
     <w:p>
       <w:pPr>
         <w:pStyle w:val="Subtitle"/>
-      </w:pPr>
-      <w:r>
+        <w:rPr>
+          <w:lang w:val="en-US"/>
+        </w:rPr>
+      </w:pPr>
+      <w:r>
+        <w:rPr>
+          <w:lang w:val="en-US"/>
+        </w:rPr>
         <w:t>Paired human-agent collaboration with shared persistent brain, local-first inference, and pooled remote escalation</w:t>
       </w:r>
     </w:p>
     <w:p>
-      <w:r>
+      <w:pPr>
+        <w:rPr>
+          <w:lang w:val="en-US"/>
+        </w:rPr>
+      </w:pPr>
+      <w:r>
+        <w:rPr>
+          <w:lang w:val="en-US"/>
+        </w:rPr>
         <w:t>Architecture v1 - 2026-05-23</w:t>
       </w:r>
     </w:p>
-    <w:p/>
-    <w:p>
-      <w:r>
+    <w:p>
+      <w:pPr>
+        <w:rPr>
+          <w:lang w:val="en-US"/>
+        </w:rPr>
+      </w:pPr>
+    </w:p>
+    <w:p>
+      <w:pPr>
+        <w:rPr>
+          <w:lang w:val="en-US"/>
+        </w:rPr>
+      </w:pPr>
+      <w:r>
+        <w:rPr>
+          <w:lang w:val="en-US"/>
+        </w:rPr>
         <w:br w:type="page"/>
       </w:r>
     </w:p>
     <w:p>
       <w:pPr>
         <w:pStyle w:val="Heading1"/>
-      </w:pPr>
-      <w:r>
-        <w:lastRenderedPageBreak/>
+        <w:rPr>
+          <w:lang w:val="en-US"/>
+        </w:rPr>
+      </w:pPr>
+      <w:r>
+        <w:rPr>
+          <w:lang w:val="en-US"/>
+        </w:rPr>
         <w:t>1. Executive summary</w:t>
       </w:r>
     </w:p>
     <w:p>
-      <w:r>
-        <w:t>MCounterPart bonds each human architect to one dedicated Augment Agent. Pairs share one workspace, one memory, one rule set; coordination is through file-based inboxes and scheduled background work. The product scales by adding pairs, not by scaling a single agent. Cost is minimized via a 5-tier routing ladder: local CModel, counterpart agent, scheduled task, clone-queue, inline airouter. The standing rule is: always pick the path with the lowest token cost, and continuously train CHost-local helpers (CModel, scheduled scripts, future MCP-Worker daemon) so they handle more work over time with less agent involvement.</w:t>
+      <w:pPr>
+        <w:rPr>
+          <w:lang w:val="en-US"/>
+        </w:rPr>
+      </w:pPr>
+      <w:r>
+        <w:rPr>
+          <w:lang w:val="en-US"/>
+        </w:rPr>
+        <w:t xml:space="preserve">MCounterPart bonds each human architect to one dedicated Augment Agent. Pairs share one workspace, one memory, one rule set; coordination is through file-based inboxes and scheduled background work. The product scales by adding pairs, not by scaling a single agent. Cost is minimized via a 5-tier routing ladder: local CModel, counterpart agent, scheduled task, clone-queue, inline airouter. </w:t>
+      </w:r>
+      <w:r>
+        <w:rPr>
+          <w:lang w:val="en-US"/>
+        </w:rPr>
+        <w:t>The standing rule is: always pick the path with the lowest token cost, and continuously train CHost-local helpers (CModel, scheduled scripts, future MCP-Worker daemon) so they handle more work over time with less agent involvement.</w:t>
       </w:r>
     </w:p>
     <w:p>
@@ -60,7 +113,13 @@
           <wp:inline distT="0" distB="0" distL="0" distR="0" wp14:anchorId="09DD195D" wp14:editId="21B60BC5">
             <wp:extent cx="5731510" cy="1071245"/>
             <wp:effectExtent l="0" t="0" r="2540" b="0"/>
-            <wp:docPr id="772317117" name="Picture 1"/>
+            <wp:docPr id="772317117" name="Picture 1">
+              <a:extLst xmlns:a="http://schemas.openxmlformats.org/drawingml/2006/main">
+                <a:ext uri="{FF2B5EF4-FFF2-40B4-BE49-F238E27FC236}">
+                  <a16:creationId xmlns:a16="http://schemas.microsoft.com/office/drawing/2014/main" id="{39C729F9-0B04-4ACE-B6CD-2DDDD507358B}"/>
+                </a:ext>
+              </a:extLst>
+            </wp:docPr>
             <wp:cNvGraphicFramePr/>
             <a:graphic xmlns:a="http://schemas.openxmlformats.org/drawingml/2006/main">
               <a:graphicData uri="http://schemas.openxmlformats.org/drawingml/2006/picture">
@@ -130,12 +189,6 @@
         <w:gridCol w:w="2257"/>
       </w:tblGrid>
       <w:tr>
-        <w:tblPrEx>
-          <w:tblCellMar>
-            <w:top w:w="0" w:type="dxa"/>
-            <w:bottom w:w="0" w:type="dxa"/>
-          </w:tblCellMar>
-        </w:tblPrEx>
         <w:tc>
           <w:tcPr>
             <w:tcW w:w="2256" w:type="dxa"/>
@@ -178,12 +231,6 @@
         </w:tc>
       </w:tr>
       <w:tr>
-        <w:tblPrEx>
-          <w:tblCellMar>
-            <w:top w:w="0" w:type="dxa"/>
-            <w:bottom w:w="0" w:type="dxa"/>
-          </w:tblCellMar>
-        </w:tblPrEx>
         <w:tc>
           <w:tcPr>
             <w:tcW w:w="2256" w:type="dxa"/>
@@ -209,7 +256,15 @@
             <w:tcW w:w="2257" w:type="dxa"/>
           </w:tcPr>
           <w:p>
-            <w:r>
+            <w:pPr>
+              <w:rPr>
+                <w:lang w:val="en-US"/>
+              </w:rPr>
+            </w:pPr>
+            <w:r>
+              <w:rPr>
+                <w:lang w:val="en-US"/>
+              </w:rPr>
               <w:t>Per-architect VS Code + Augment subscription</w:t>
             </w:r>
           </w:p>
@@ -226,12 +281,6 @@
         </w:tc>
       </w:tr>
       <w:tr>
-        <w:tblPrEx>
-          <w:tblCellMar>
-            <w:top w:w="0" w:type="dxa"/>
-            <w:bottom w:w="0" w:type="dxa"/>
-          </w:tblCellMar>
-        </w:tblPrEx>
         <w:tc>
           <w:tcPr>
             <w:tcW w:w="2256" w:type="dxa"/>
@@ -274,12 +323,6 @@
         </w:tc>
       </w:tr>
       <w:tr>
-        <w:tblPrEx>
-          <w:tblCellMar>
-            <w:top w:w="0" w:type="dxa"/>
-            <w:bottom w:w="0" w:type="dxa"/>
-          </w:tblCellMar>
-        </w:tblPrEx>
         <w:tc>
           <w:tcPr>
             <w:tcW w:w="2256" w:type="dxa"/>
@@ -322,12 +365,6 @@
         </w:tc>
       </w:tr>
       <w:tr>
-        <w:tblPrEx>
-          <w:tblCellMar>
-            <w:top w:w="0" w:type="dxa"/>
-            <w:bottom w:w="0" w:type="dxa"/>
-          </w:tblCellMar>
-        </w:tblPrEx>
         <w:tc>
           <w:tcPr>
             <w:tcW w:w="2256" w:type="dxa"/>
@@ -343,7 +380,15 @@
             <w:tcW w:w="2256" w:type="dxa"/>
           </w:tcPr>
           <w:p>
-            <w:r>
+            <w:pPr>
+              <w:rPr>
+                <w:lang w:val="en-US"/>
+              </w:rPr>
+            </w:pPr>
+            <w:r>
+              <w:rPr>
+                <w:lang w:val="en-US"/>
+              </w:rPr>
               <w:t>Airouter pool (2 keys x 3 slots = 6)</w:t>
             </w:r>
           </w:p>
@@ -370,12 +415,6 @@
         </w:tc>
       </w:tr>
       <w:tr>
-        <w:tblPrEx>
-          <w:tblCellMar>
-            <w:top w:w="0" w:type="dxa"/>
-            <w:bottom w:w="0" w:type="dxa"/>
-          </w:tblCellMar>
-        </w:tblPrEx>
         <w:tc>
           <w:tcPr>
             <w:tcW w:w="2256" w:type="dxa"/>
@@ -418,12 +457,6 @@
         </w:tc>
       </w:tr>
       <w:tr>
-        <w:tblPrEx>
-          <w:tblCellMar>
-            <w:top w:w="0" w:type="dxa"/>
-            <w:bottom w:w="0" w:type="dxa"/>
-          </w:tblCellMar>
-        </w:tblPrEx>
         <w:tc>
           <w:tcPr>
             <w:tcW w:w="2256" w:type="dxa"/>
@@ -466,12 +499,6 @@
         </w:tc>
       </w:tr>
       <w:tr>
-        <w:tblPrEx>
-          <w:tblCellMar>
-            <w:top w:w="0" w:type="dxa"/>
-            <w:bottom w:w="0" w:type="dxa"/>
-          </w:tblCellMar>
-        </w:tblPrEx>
         <w:tc>
           <w:tcPr>
             <w:tcW w:w="2256" w:type="dxa"/>
@@ -520,61 +547,132 @@
         <w:pStyle w:val="Heading1"/>
       </w:pPr>
       <w:r>
-        <w:lastRenderedPageBreak/>
         <w:t>4. The pair contract</w:t>
       </w:r>
     </w:p>
     <w:p>
-      <w:r>
+      <w:pPr>
+        <w:rPr>
+          <w:lang w:val="en-US"/>
+        </w:rPr>
+      </w:pPr>
+      <w:r>
+        <w:rPr>
+          <w:lang w:val="en-US"/>
+        </w:rPr>
         <w:t>A pair = 1 human + 1 dedicated agent on 1 host. Today: Jose + CHost-agent, Juan + Laptop-agent. Each pair owns one Augment subscription. Both pairs read the same AGENTS.md, agent-operating-rules.md, LESSONS.md, and SESSION_LOG.md. Counterpart-first delegation (R2) is symmetric: either agent forwards the user's request to the other before acting. Important terminology: a CHost agent's counterpart is the laptop agent (different host, different human, different subscription). There is no second Augment Agent running on the same host.</w:t>
       </w:r>
     </w:p>
     <w:p>
       <w:pPr>
         <w:pStyle w:val="Heading1"/>
-      </w:pPr>
-      <w:r>
+        <w:rPr>
+          <w:lang w:val="en-US"/>
+        </w:rPr>
+      </w:pPr>
+      <w:r>
+        <w:rPr>
+          <w:lang w:val="en-US"/>
+        </w:rPr>
         <w:t>5. Shared brain</w:t>
       </w:r>
     </w:p>
     <w:p>
-      <w:r>
+      <w:pPr>
+        <w:rPr>
+          <w:lang w:val="en-US"/>
+        </w:rPr>
+      </w:pPr>
+      <w:r>
+        <w:rPr>
+          <w:lang w:val="en-US"/>
+        </w:rPr>
         <w:t>Memory: .augment/memory/{raw,distilled,index}/YYYY-MM-DD.&lt;architect&gt;.jsonl. Append-only daily files per architect. The cold-path job (02:00 daily, CHost) summarizes raw to distilled and embeds for retrieval.</w:t>
       </w:r>
     </w:p>
     <w:p>
-      <w:r>
+      <w:pPr>
+        <w:rPr>
+          <w:lang w:val="en-US"/>
+        </w:rPr>
+      </w:pPr>
+      <w:r>
+        <w:rPr>
+          <w:lang w:val="en-US"/>
+        </w:rPr>
         <w:t>Inbox queues: .augment/agent-tasks/inbox-{chost,laptop}.jsonl plus done.jsonl. Read by agent-task-list.ps1; mutated by agent-task-assign.ps1 and agent-task-complete.ps1.</w:t>
       </w:r>
     </w:p>
     <w:p>
-      <w:r>
+      <w:pPr>
+        <w:rPr>
+          <w:lang w:val="en-US"/>
+        </w:rPr>
+      </w:pPr>
+      <w:r>
+        <w:rPr>
+          <w:lang w:val="en-US"/>
+        </w:rPr>
         <w:t>Awareness: inbox-notifier scheduled task pops a 15-second Windows toast within 2 minutes of any new pending inbox entry. Alert-only; never auto-executes.</w:t>
       </w:r>
     </w:p>
     <w:p>
       <w:pPr>
         <w:pStyle w:val="Heading1"/>
-      </w:pPr>
-      <w:r>
+        <w:rPr>
+          <w:lang w:val="en-US"/>
+        </w:rPr>
+      </w:pPr>
+      <w:r>
+        <w:rPr>
+          <w:lang w:val="en-US"/>
+        </w:rPr>
         <w:t>6. Local fleet on CHost</w:t>
       </w:r>
     </w:p>
     <w:p>
-      <w:r>
-        <w:t>CModel-writer = qwen2.5-coder:7b-instruct-q4_K_M for generation. CModel-retriever = nomic-embed-text for embeddings. Served by Ollama at 127.0.0.1:11434 on CHost; laptop reaches them via Tailscale at 100.83.6.49:11434. OLLAMA_MAX_LOADED_MODELS=2, OLLAMA_NUM_PARALLEL=1. Batching discipline: all writer calls first, then all retriever calls, to avoid model evict-reload thrash (10 to 15 seconds per swap). keep_alive=24h on every call.</w:t>
+      <w:pPr>
+        <w:rPr>
+          <w:lang w:val="en-US"/>
+        </w:rPr>
+      </w:pPr>
+      <w:r>
+        <w:rPr>
+          <w:lang w:val="en-US"/>
+        </w:rPr>
+        <w:t xml:space="preserve">CModel-writer = qwen2.5-coder:7b-instruct-q4_K_M for generation. </w:t>
+      </w:r>
+      <w:r>
+        <w:rPr>
+          <w:lang w:val="en-US"/>
+        </w:rPr>
+        <w:t>CModel-retriever = nomic-embed-text for embeddings. Served by Ollama at 127.0.0.1:11434 on CHost; laptop reaches them via Tailscale at 100.83.6.49:11434. OLLAMA_MAX_LOADED_MODELS=2, OLLAMA_NUM_PARALLEL=1. Batching discipline: all writer calls first, then all retriever calls, to avoid model evict-reload thrash (10 to 15 seconds per swap). keep_alive=24h on every call.</w:t>
       </w:r>
     </w:p>
     <w:p>
       <w:pPr>
         <w:pStyle w:val="Heading1"/>
-      </w:pPr>
-      <w:r>
+        <w:rPr>
+          <w:lang w:val="en-US"/>
+        </w:rPr>
+      </w:pPr>
+      <w:r>
+        <w:rPr>
+          <w:lang w:val="en-US"/>
+        </w:rPr>
         <w:t>7. Remote fleet - airouter slot allocation</w:t>
       </w:r>
     </w:p>
     <w:p>
-      <w:r>
+      <w:pPr>
+        <w:rPr>
+          <w:lang w:val="en-US"/>
+        </w:rPr>
+      </w:pPr>
+      <w:r>
+        <w:rPr>
+          <w:lang w:val="en-US"/>
+        </w:rPr>
         <w:t>Two keys, 3 concurrent calls per key, 6 total slots.</w:t>
       </w:r>
     </w:p>
@@ -604,12 +702,6 @@
         <w:gridCol w:w="1806"/>
       </w:tblGrid>
       <w:tr>
-        <w:tblPrEx>
-          <w:tblCellMar>
-            <w:top w:w="0" w:type="dxa"/>
-            <w:bottom w:w="0" w:type="dxa"/>
-          </w:tblCellMar>
-        </w:tblPrEx>
         <w:tc>
           <w:tcPr>
             <w:tcW w:w="1805" w:type="dxa"/>
@@ -662,12 +754,6 @@
         </w:tc>
       </w:tr>
       <w:tr>
-        <w:tblPrEx>
-          <w:tblCellMar>
-            <w:top w:w="0" w:type="dxa"/>
-            <w:bottom w:w="0" w:type="dxa"/>
-          </w:tblCellMar>
-        </w:tblPrEx>
         <w:tc>
           <w:tcPr>
             <w:tcW w:w="1805" w:type="dxa"/>
@@ -693,7 +779,15 @@
             <w:tcW w:w="1805" w:type="dxa"/>
           </w:tcPr>
           <w:p>
-            <w:r>
+            <w:pPr>
+              <w:rPr>
+                <w:lang w:val="en-US"/>
+              </w:rPr>
+            </w:pPr>
+            <w:r>
+              <w:rPr>
+                <w:lang w:val="en-US"/>
+              </w:rPr>
               <w:t>Master reasoning (remote-master-call)</w:t>
             </w:r>
           </w:p>
@@ -720,12 +814,6 @@
         </w:tc>
       </w:tr>
       <w:tr>
-        <w:tblPrEx>
-          <w:tblCellMar>
-            <w:top w:w="0" w:type="dxa"/>
-            <w:bottom w:w="0" w:type="dxa"/>
-          </w:tblCellMar>
-        </w:tblPrEx>
         <w:tc>
           <w:tcPr>
             <w:tcW w:w="1805" w:type="dxa"/>
@@ -751,7 +839,15 @@
             <w:tcW w:w="1805" w:type="dxa"/>
           </w:tcPr>
           <w:p>
-            <w:r>
+            <w:pPr>
+              <w:rPr>
+                <w:lang w:val="en-US"/>
+              </w:rPr>
+            </w:pPr>
+            <w:r>
+              <w:rPr>
+                <w:lang w:val="en-US"/>
+              </w:rPr>
               <w:t>Coding (refactors, multi-file edits)</w:t>
             </w:r>
           </w:p>
@@ -778,12 +874,6 @@
         </w:tc>
       </w:tr>
       <w:tr>
-        <w:tblPrEx>
-          <w:tblCellMar>
-            <w:top w:w="0" w:type="dxa"/>
-            <w:bottom w:w="0" w:type="dxa"/>
-          </w:tblCellMar>
-        </w:tblPrEx>
         <w:tc>
           <w:tcPr>
             <w:tcW w:w="1805" w:type="dxa"/>
@@ -819,7 +909,15 @@
             <w:tcW w:w="1805" w:type="dxa"/>
           </w:tcPr>
           <w:p>
-            <w:r>
+            <w:pPr>
+              <w:rPr>
+                <w:lang w:val="en-US"/>
+              </w:rPr>
+            </w:pPr>
+            <w:r>
+              <w:rPr>
+                <w:lang w:val="en-US"/>
+              </w:rPr>
               <w:t>CHost background queue, every 10 min</w:t>
             </w:r>
           </w:p>
@@ -836,19 +934,12 @@
         </w:tc>
       </w:tr>
       <w:tr>
-        <w:tblPrEx>
-          <w:tblCellMar>
-            <w:top w:w="0" w:type="dxa"/>
-            <w:bottom w:w="0" w:type="dxa"/>
-          </w:tblCellMar>
-        </w:tblPrEx>
-        <w:tc>
-          <w:tcPr>
-            <w:tcW w:w="1805" w:type="dxa"/>
-          </w:tcPr>
-          <w:p>
-            <w:r>
-              <w:lastRenderedPageBreak/>
+        <w:tc>
+          <w:tcPr>
+            <w:tcW w:w="1805" w:type="dxa"/>
+          </w:tcPr>
+          <w:p>
+            <w:r>
               <w:t>4</w:t>
             </w:r>
           </w:p>
@@ -895,12 +986,6 @@
         </w:tc>
       </w:tr>
       <w:tr>
-        <w:tblPrEx>
-          <w:tblCellMar>
-            <w:top w:w="0" w:type="dxa"/>
-            <w:bottom w:w="0" w:type="dxa"/>
-          </w:tblCellMar>
-        </w:tblPrEx>
         <w:tc>
           <w:tcPr>
             <w:tcW w:w="1805" w:type="dxa"/>
@@ -953,12 +1038,6 @@
         </w:tc>
       </w:tr>
       <w:tr>
-        <w:tblPrEx>
-          <w:tblCellMar>
-            <w:top w:w="0" w:type="dxa"/>
-            <w:bottom w:w="0" w:type="dxa"/>
-          </w:tblCellMar>
-        </w:tblPrEx>
         <w:tc>
           <w:tcPr>
             <w:tcW w:w="1805" w:type="dxa"/>
@@ -1013,70 +1092,158 @@
     </w:tbl>
     <w:p/>
     <w:p>
-      <w:r>
+      <w:pPr>
+        <w:rPr>
+          <w:lang w:val="en-US"/>
+        </w:rPr>
+      </w:pPr>
+      <w:r>
+        <w:rPr>
+          <w:lang w:val="en-US"/>
+        </w:rPr>
         <w:t>Per-purpose routing in airouter.config.json byPurpose block: reasoning, coding, fastCheap, longContext, multimodal. airouter-pick.ps1 -Purpose &lt;name&gt; resolves at call time. .current is the fallback.</w:t>
       </w:r>
     </w:p>
     <w:p>
       <w:pPr>
         <w:pStyle w:val="Heading1"/>
-      </w:pPr>
-      <w:r>
+        <w:rPr>
+          <w:lang w:val="en-US"/>
+        </w:rPr>
+      </w:pPr>
+      <w:r>
+        <w:rPr>
+          <w:lang w:val="en-US"/>
+        </w:rPr>
         <w:t>8. Weekly bake-off (zero in-session token cost)</w:t>
       </w:r>
     </w:p>
     <w:p>
-      <w:r>
+      <w:pPr>
+        <w:rPr>
+          <w:lang w:val="en-US"/>
+        </w:rPr>
+      </w:pPr>
+      <w:r>
+        <w:rPr>
+          <w:lang w:val="en-US"/>
+        </w:rPr>
         <w:t>Runs every Sunday 04:00 via the existing AugmentRemoteMasterReview scheduled task. Steps: (1) GET /models (free metadata). (2) For every model live on airouter, run one prompt per purpose category: reasoning (3-step logic), coding (small function with test), fastCheap (1-sentence classify), longContext (needle-in-haystack at 100k tokens, only if ctx &gt;= 200k), multimodal (small image describe, only if image-input). (3) Score: ok, latency_ms, tokens, correctness_heuristic. (4) Append one JSON line per (model, purpose) to .remote-master-reviews.jsonl. (5) Print top-3 per category. (6) Never auto-switch byPurpose - the agent or human decides and records in SESSION_LOG.md.</w:t>
       </w:r>
     </w:p>
     <w:p>
-      <w:r>
+      <w:pPr>
+        <w:rPr>
+          <w:lang w:val="en-US"/>
+        </w:rPr>
+      </w:pPr>
+      <w:r>
+        <w:rPr>
+          <w:lang w:val="en-US"/>
+        </w:rPr>
         <w:t>Runner = slot 5 on K2, off-hours. Per-week worst case ~25 calls at smokeMaxTokens=1024 = ~25 K output tokens / week on K2. Zero tokens on either agent's in-session budget.</w:t>
       </w:r>
     </w:p>
     <w:p>
       <w:pPr>
         <w:pStyle w:val="Heading1"/>
-      </w:pPr>
-      <w:r>
+        <w:rPr>
+          <w:lang w:val="en-US"/>
+        </w:rPr>
+      </w:pPr>
+      <w:r>
+        <w:rPr>
+          <w:lang w:val="en-US"/>
+        </w:rPr>
         <w:t>9. Token discipline and telemetry</w:t>
       </w:r>
     </w:p>
     <w:p>
-      <w:r>
+      <w:pPr>
+        <w:rPr>
+          <w:lang w:val="en-US"/>
+        </w:rPr>
+      </w:pPr>
+      <w:r>
+        <w:rPr>
+          <w:lang w:val="en-US"/>
+        </w:rPr>
         <w:t>Routing ladder R3 cheapest tier first: (1) Local CModel, (2) Counterpart agent, (3) Scheduled task, (4) Clone-queue, (5) Inline airouter. Skip a tier only with a stated reason.</w:t>
       </w:r>
     </w:p>
     <w:p>
-      <w:r>
+      <w:pPr>
+        <w:rPr>
+          <w:lang w:val="en-US"/>
+        </w:rPr>
+      </w:pPr>
+      <w:r>
+        <w:rPr>
+          <w:lang w:val="en-US"/>
+        </w:rPr>
         <w:t>Telemetry: .airouter-budget.jsonl (per remote-master-call cost log), .remote-master-reviews.jsonl (weekly bake-off), agent-spend-digest.ps1 planned (weekly per-pair per-tier summary).</w:t>
       </w:r>
     </w:p>
     <w:p>
-      <w:r>
+      <w:pPr>
+        <w:rPr>
+          <w:lang w:val="en-US"/>
+        </w:rPr>
+      </w:pPr>
+      <w:r>
+        <w:rPr>
+          <w:lang w:val="en-US"/>
+        </w:rPr>
         <w:t>Commander-in-chief rule: the agent measures its own in-session token cost on non-trivial responses and reports it inline.</w:t>
       </w:r>
     </w:p>
     <w:p>
       <w:pPr>
         <w:pStyle w:val="Heading1"/>
-      </w:pPr>
-      <w:r>
+        <w:rPr>
+          <w:lang w:val="en-US"/>
+        </w:rPr>
+      </w:pPr>
+      <w:r>
+        <w:rPr>
+          <w:lang w:val="en-US"/>
+        </w:rPr>
         <w:t>10. Implementation status and roadmap</w:t>
       </w:r>
     </w:p>
     <w:p>
-      <w:r>
+      <w:pPr>
+        <w:rPr>
+          <w:lang w:val="en-US"/>
+        </w:rPr>
+      </w:pPr>
+      <w:r>
+        <w:rPr>
+          <w:lang w:val="en-US"/>
+        </w:rPr>
         <w:t>Done: counterpart-first review-loop, JSONL inboxes, toast notifier, local CModel fleet, scheduled cold-path / clone-worker / auto-checkpoint, OneDrive + git two-tier persistence, session-briefing single-read.</w:t>
       </w:r>
     </w:p>
     <w:p>
-      <w:r>
+      <w:pPr>
+        <w:rPr>
+          <w:lang w:val="en-US"/>
+        </w:rPr>
+      </w:pPr>
+      <w:r>
+        <w:rPr>
+          <w:lang w:val="en-US"/>
+        </w:rPr>
         <w:t>Pending (gated on user confirmation): AIROUTER_API_KEY_2 env var; byPurpose block in airouter.config.json; airouter-pick.ps1 helper; multi-purpose bake-off extension of remote-master-review.ps1; agent-spend-digest.ps1 weekly digest; MCP-Worker daemon (CHost-local executor of file-dropped jobs, zero agent tokens on re-runs); rename Counterpart architecture section in AGENTS.md to MCounterPart architecture.</w:t>
       </w:r>
     </w:p>
-    <w:p/>
+    <w:p>
+      <w:pPr>
+        <w:rPr>
+          <w:lang w:val="en-US"/>
+        </w:rPr>
+      </w:pPr>
+    </w:p>
     <w:sectPr>
       <w:pgSz w:w="11906" w:h="16838"/>
       <w:pgMar w:top="1440" w:right="1440" w:bottom="1440" w:left="1440" w:header="708" w:footer="708" w:gutter="0"/>

</xml_diff>